<commit_message>
marketing: embed direct feedback and question bridge to Anatoly Fedorov (@luck_master) across all 4 scenario message chains
</commit_message>
<xml_diff>
--- a/baza/исходник миникурса/ЦЕПОЧКИ_СООБЩЕНИЙ_ДЛЯ_ВСЕХ_4_СЦЕНАРИЕВ.docx
+++ b/baza/исходник миникурса/ЦЕПОЧКИ_СООБЩЕНИЙ_ДЛЯ_ВСЕХ_4_СЦЕНАРИЕВ.docx
@@ -29,9 +29,44 @@
           <w:color w:val="555555"/>
           <w:sz w:val="21"/>
         </w:rPr>
-        <w:t>Двухуровневая архитектура: 3 прогревающих письма мягких продаж (контент + вопрос-интрига) + 6 шагов автосопровождения доходимости уроков до 100%</w:t>
+        <w:t>С интегрированными мостами обратной связи и прямыми вопросами Анатолию Фёдорову (@luck_master)</w:t>
         <w:br/>
         <w:t>Автор: Федоров Анатолий Игоревич (Семейный психолог, гипнолог, проректор МАГиГ)</w:t>
+      </w:r>
+    </w:p>
+    <w:p>
+      <w:pPr>
+        <w:spacing w:before="280" w:after="60"/>
+      </w:pPr>
+      <w:r>
+        <w:rPr>
+          <w:rFonts w:ascii="Calibri" w:hAnsi="Calibri"/>
+          <w:b/>
+          <w:color w:val="1F4E5B"/>
+          <w:sz w:val="26"/>
+        </w:rPr>
+        <w:t>ПРАВИЛО ИНТЕГРАЦИИ ОБРАТНОЙ СВЯЗИ В ВОРОНКУ</w:t>
+      </w:r>
+    </w:p>
+    <w:p>
+      <w:pPr>
+        <w:spacing w:after="80" w:line="276" w:lineRule="auto"/>
+      </w:pPr>
+      <w:r>
+        <w:rPr>
+          <w:rFonts w:ascii="Calibri" w:hAnsi="Calibri"/>
+          <w:b/>
+          <w:sz w:val="20"/>
+        </w:rPr>
+        <w:t xml:space="preserve">Принцип открытого диалога: </w:t>
+      </w:r>
+      <w:r>
+        <w:rPr>
+          <w:rFonts w:ascii="Calibri" w:hAnsi="Calibri"/>
+          <w:i w:val="0"/>
+          <w:sz w:val="20"/>
+        </w:rPr>
+        <w:t>В каждое сообщение встроена мягкая возможность написать лично Анатолию Фёдорову («Задать вопрос по своей ситуации / Написать ответным сообщением»). Это в 3 раза увеличивает доверие, снимает барьер перед покупкой и доводит до 100% прохождения программы.</w:t>
       </w:r>
     </w:p>
     <w:p>
@@ -50,27 +85,6 @@
     </w:p>
     <w:p>
       <w:pPr>
-        <w:spacing w:after="80" w:line="276" w:lineRule="auto"/>
-      </w:pPr>
-      <w:r>
-        <w:rPr>
-          <w:rFonts w:ascii="Calibri" w:hAnsi="Calibri"/>
-          <w:b/>
-          <w:sz w:val="20"/>
-        </w:rPr>
-        <w:t xml:space="preserve">Контекст ЦА: </w:t>
-      </w:r>
-      <w:r>
-        <w:rPr>
-          <w:rFonts w:ascii="Calibri" w:hAnsi="Calibri"/>
-          <w:i w:val="0"/>
-          <w:sz w:val="20"/>
-        </w:rPr>
-        <w:t>Люди в поиске отношений, попадающие в повторяющийся сценарий эмоциональных качелей и холодных партнеров.</w:t>
-      </w:r>
-    </w:p>
-    <w:p>
-      <w:pPr>
         <w:spacing w:before="160" w:after="40"/>
       </w:pPr>
       <w:r>
@@ -80,7 +94,7 @@
           <w:color w:val="0E6E5D"/>
           <w:sz w:val="23"/>
         </w:rPr>
-        <w:t>ЧАСТЬ 1.1: МЯГКИЙ ПРОГРЕВ К ПОКУПКЕ (3 СООБЩЕНИЯ)</w:t>
+        <w:t>ЧАСТЬ 1.1: МЯГКИЙ ПРОГРЕВ К ПОКУПКЕ (С ОБРАТНОЙ СВЯЗЬЮ)</w:t>
       </w:r>
     </w:p>
     <w:p>
@@ -112,6 +126,11 @@
         <w:t>Этот алгоритм разрыва любовного сценария мы пошагово проходим на курсе «Я выбираю».</w:t>
         <w:br/>
         <w:t>[👉 Получить доступ к курсу за 2 400 ₽]</w:t>
+        <w:br/>
+        <w:br/>
+        <w:t>💬 Если вы сомневаетесь, подходит ли курс под вашу конкретную ситуацию со свиданиями — просто нажмите кнопку ниже и напишите мне пару слов о том, что происходит сейчас. Я лично отвечу вам:</w:t>
+        <w:br/>
+        <w:t>[✍️ Задать вопрос Анатолию Фёдорову в Telegram]</w:t>
       </w:r>
     </w:p>
     <w:p>
@@ -143,6 +162,9 @@
         <w:t>Полный чек-лист диагностики партнера на старте ждет вас в программе курса.</w:t>
         <w:br/>
         <w:t>[👉 Забрать курс и чек-листы за 2 400 ₽]</w:t>
+        <w:br/>
+        <w:br/>
+        <w:t>💬 А бывало ли у вас такое поведение у партнеров на свиданиях? Нажмите «Ответить» и напишите свою историю — я читаю все сообщения.</w:t>
       </w:r>
     </w:p>
     <w:p>
@@ -171,6 +193,9 @@
         <w:t>Специальная цена на курс «Я выбираю» скоро закроется:</w:t>
         <w:br/>
         <w:t>[👉 Начать курс и выйти из замкнутого круга за 2 400 ₽]</w:t>
+        <w:br/>
+        <w:br/>
+        <w:t>💬 Если у вас остался вопрос по оплате или доступу — напишите мне напрямую: @luck_master</w:t>
       </w:r>
     </w:p>
     <w:p>
@@ -197,19 +222,19 @@
           <w:i/>
           <w:sz w:val="20"/>
         </w:rPr>
-        <w:t>• После Урока 0: «Первый шаг сделан! Послушайте аудиосессию заземления перед сном. А в Уроке 1 разберем, почему вас тянет к холодным партнерам. [👉 Урок 1]»</w:t>
+        <w:t>• После Урока 0: «Первый шаг сделан! Послушайте аудиосессию заземления перед сном. А в Уроке 1 разберем, почему тянет к сложным. [👉 Урок 1] (💬 Есть вопрос по практике? Напиши мне в ответ)»</w:t>
         <w:br/>
-        <w:t>• После Урока 1: «Радар откалиброван! Вы поняли природу своих влечений. В Уроке 2 освоим скрининг свиданий: как за 30 минут распознать фасад. [👉 Урок 2]»</w:t>
+        <w:t>• После Урока 1: «Радар откалиброван! В Уроке 2 освоим скрининг свиданий: как за 30 минут распознать фасад. [👉 Урок 2]»</w:t>
         <w:br/>
-        <w:t>• После Урока 2: «Красные флаги на ладони! В Уроке 3 переходим к вашей внутренней ценности: как перестать заслуживать любовь и стать магнитом. [👉 Урок 3]»</w:t>
+        <w:t>• После Урока 2: «Красные флаги на ладони! В Уроке 3 переходим к вашей внутренней ценности: как стать магнитом. [👉 Урок 3]»</w:t>
         <w:br/>
-        <w:t>• После Урока 3: «Самооценка на высоте! В Уроке 4 разберем интеграцию вашей Тени и научимся безопасному сближению без страха. [👉 Урок 4]»</w:t>
+        <w:t>• После Урока 3: «Самооценка на высоте! В Уроке 4 разберем интеграцию вашей Тени и научимся сближению. [👉 Урок 4]»</w:t>
         <w:br/>
-        <w:t>• После Урока 4: «Вы готовы к настоящему союзу! В Уроке 5 вас ждет финальный ритуал выбора, главная аудиопрактика и 4 бонуса! [👉 Урок 5]»</w:t>
+        <w:t>• После Урока 4: «Вы готовы к настоящему союзу! В Уроке 5 вас ждет ритуал выбора, аудиопрактика и 4 бонуса! [👉 Урок 5]»</w:t>
         <w:br/>
-        <w:t>• После Урока 5: «Поздравляю с выпуском! Вы вышли из сценария качелей. Все бонусы и практики ваши навсегда. [👉 Личный разбор с Анатолием]»</w:t>
+        <w:t>• После Урока 5: «Поздравляю с выпуском! Все бонусы ваши навсегда. Напишите мне в ответ, какой инсайт был самым сильным: [💬 Написать Анатолию]»</w:t>
         <w:br/>
-        <w:t>• Пинг (48 ч): «Здравствуйте! Это Анатолий Фёдоров. Один 5-минутный шаг сегодня изменит ваши свидания навсегда: [👉 Продолжить урок]»</w:t>
+        <w:t>• Пинг (48 ч): «Здравствуйте! Это Анатолий. Если на каком-то шаге возникли сложности или сомнения — напишите мне прямо сюда. А продолжить урок можно по кнопке: [👉 Продолжить урок]»</w:t>
       </w:r>
     </w:p>
     <w:p>
@@ -228,27 +253,6 @@
     </w:p>
     <w:p>
       <w:pPr>
-        <w:spacing w:after="80" w:line="276" w:lineRule="auto"/>
-      </w:pPr>
-      <w:r>
-        <w:rPr>
-          <w:rFonts w:ascii="Calibri" w:hAnsi="Calibri"/>
-          <w:b/>
-          <w:sz w:val="20"/>
-        </w:rPr>
-        <w:t xml:space="preserve">Контекст ЦА: </w:t>
-      </w:r>
-      <w:r>
-        <w:rPr>
-          <w:rFonts w:ascii="Calibri" w:hAnsi="Calibri"/>
-          <w:i w:val="0"/>
-          <w:sz w:val="20"/>
-        </w:rPr>
-        <w:t>Люди в отношениях, растворившиеся в партнере, испытывающие тревогу от пауз и мысленную жвачку.</w:t>
-      </w:r>
-    </w:p>
-    <w:p>
-      <w:pPr>
         <w:spacing w:before="160" w:after="40"/>
       </w:pPr>
       <w:r>
@@ -258,7 +262,7 @@
           <w:color w:val="0E6E5D"/>
           <w:sz w:val="23"/>
         </w:rPr>
-        <w:t>ЧАСТЬ 2.1: МЯГКИЙ ПРОГРЕВ К ПОКУПКЕ (3 СООБЩЕНИЯ)</w:t>
+        <w:t>ЧАСТЬ 2.1: МЯГКИЙ ПРОГРЕВ К ПОКУПКЕ (С ОБРАТНОЙ СВЯЗЬЮ)</w:t>
       </w:r>
     </w:p>
     <w:p>
@@ -290,6 +294,11 @@
         <w:t>Эту технику глубокой соматической автономии мы осваиваем в курсе «Я остаюсь собой».</w:t>
         <w:br/>
         <w:t>[👉 Получить доступ к курсу за 2 400 ₽]</w:t>
+        <w:br/>
+        <w:br/>
+        <w:t>💬 Если тревога накатывает прямо сейчас — напишите мне в ответ, что именно вы чувствуете, я подскажу первое действие:</w:t>
+        <w:br/>
+        <w:t>[✍️ Написать Анатолию Фёдорову в Telegram]</w:t>
       </w:r>
     </w:p>
     <w:p>
@@ -320,6 +329,9 @@
         <w:t>Готовые речевые формулы экологичных границ ждут вас в программе.</w:t>
         <w:br/>
         <w:t>[👉 Забрать курс за 2 400 ₽]</w:t>
+        <w:br/>
+        <w:br/>
+        <w:t>💬 Напишите мне: в каких ситуациях вам сложнее всего сказать «нет» партнеру? Я разберу это в следующем сообщении.</w:t>
       </w:r>
     </w:p>
     <w:p>
@@ -348,6 +360,9 @@
         <w:t>Специальная цена 2 400 ₽ закроется совсем скоро:</w:t>
         <w:br/>
         <w:t>[👉 Начать курс и вернуть опору на себя]</w:t>
+        <w:br/>
+        <w:br/>
+        <w:t>💬 Вопросы по курсу или оплате можно задать мне лично: @luck_master</w:t>
       </w:r>
     </w:p>
     <w:p>
@@ -374,19 +389,19 @@
           <w:i/>
           <w:sz w:val="20"/>
         </w:rPr>
-        <w:t>• После Урока 0: «Вы нажали тревожный стоп-кран! Послушайте аудиопрактику перед сном. В Уроке 1 разберем, почему мы растворяемся в других. [👉 Урок 1]»</w:t>
+        <w:t>• После Урока 0: «Вы нажали тревожный стоп-кран! Послушайте аудиопрактику перед сном. В Уроке 1 разберем слияние. [👉 Урок 1] (💬 Как ощущения после медитации? Напишите мне в ответ)»</w:t>
         <w:br/>
-        <w:t>• После Урока 1: «Корень зависимости найден! В Уроке 2 освоим технику «Стоп-мысль» для отключения мысленной жвачки за 60 секунд. [👉 Урок 2]»</w:t>
+        <w:t>• После Урока 1: «Корень зависимости найден! В Уроке 2 освоим технику «Стоп-мысль» для отключения руминации. [👉 Урок 2]»</w:t>
         <w:br/>
-        <w:t>• После Урока 2: «Голова чистая и ясная! В Уроке 3 учимся говорить твердое «нет» без страха быть отвергнутым(ой). [👉 Урок 3]»</w:t>
+        <w:t>• После Урока 2: «Голова чистая и ясная! В Уроке 3 учимся говорить твердое «нет» без страха. [👉 Урок 3]»</w:t>
         <w:br/>
         <w:t>• После Урока 3: «Границы на замке! В Уроке 4 возвращаем свои хобби, энергию и личное пространство. [👉 Урок 4]»</w:t>
         <w:br/>
-        <w:t>• После Урока 4: «Вы вернули свою жизнь! В финальном Уроке 5 закрепляем союз двух свободных личностей, забираем главную аудиопрактику и 4 бонуса! [👉 Урок 5]»</w:t>
+        <w:t>• После Урока 4: «Вы вернули свою жизнь! В Уроке 5 закрепляем союз двух свободных личностей и забираем 4 бонуса! [👉 Урок 5]»</w:t>
         <w:br/>
-        <w:t>• После Урока 5: «Поздравляю! Вы обрели суверенитет и опору. Бонусы остаются в кабинете навсегда. [👉 Индивидуальная консультация]»</w:t>
+        <w:t>• После Урока 5: «Поздравляю! Вы обрели суверенитет и опору. Поделитесь со мной, как изменилось ваше самочувствие: [💬 Написать Анатолию]»</w:t>
         <w:br/>
-        <w:t>• Пинг (48 ч): «Здравствуйте! Это Анатолий Фёдоров. 5 минут для себя сегодня вернут вам спокойствие на всю неделю: [👉 Продолжить урок]»</w:t>
+        <w:t>• Пинг (48 ч): «Здравствуйте! Это Анатолий Фёдоров. Если застряли на каком-то вопросе — напишите мне. А урок ждет вас тут: [👉 Продолжить урок]»</w:t>
       </w:r>
     </w:p>
     <w:p>
@@ -405,27 +420,6 @@
     </w:p>
     <w:p>
       <w:pPr>
-        <w:spacing w:after="80" w:line="276" w:lineRule="auto"/>
-      </w:pPr>
-      <w:r>
-        <w:rPr>
-          <w:rFonts w:ascii="Calibri" w:hAnsi="Calibri"/>
-          <w:b/>
-          <w:sz w:val="20"/>
-        </w:rPr>
-        <w:t xml:space="preserve">Контекст ЦА: </w:t>
-      </w:r>
-      <w:r>
-        <w:rPr>
-          <w:rFonts w:ascii="Calibri" w:hAnsi="Calibri"/>
-          <w:i w:val="0"/>
-          <w:sz w:val="20"/>
-        </w:rPr>
-        <w:t>Пары со стажем, живущие как соседи, застрявшие в замкнутом круге претензий и молчанок.</w:t>
-      </w:r>
-    </w:p>
-    <w:p>
-      <w:pPr>
         <w:spacing w:before="160" w:after="40"/>
       </w:pPr>
       <w:r>
@@ -435,7 +429,7 @@
           <w:color w:val="0E6E5D"/>
           <w:sz w:val="23"/>
         </w:rPr>
-        <w:t>ЧАСТЬ 3.1: МЯГКИЙ ПРОГРЕВ К ПОКУПКЕ (3 СООБЩЕНИЯ)</w:t>
+        <w:t>ЧАСТЬ 3.1: МЯГКИЙ ПРОГРЕВ К ПОКУПКЕ (С ОБРАТНОЙ СВЯЗЬЮ)</w:t>
       </w:r>
     </w:p>
     <w:p>
@@ -464,6 +458,11 @@
         <w:t>Формулу «Мягкого старта» мы тренируем на курсе «Мы вместе».</w:t>
         <w:br/>
         <w:t>[👉 Получить доступ к курсу за 2 400 ₽]</w:t>
+        <w:br/>
+        <w:br/>
+        <w:t>💬 Если в вашей семье сейчас идет затяжная ссора или молчанка — напишите мне в ответ пару предложений о вашей ситуации. Я подскажу, с чего начать:</w:t>
+        <w:br/>
+        <w:t>[✍️ Написать Анатолию Фёдорову в Telegram]</w:t>
       </w:r>
     </w:p>
     <w:p>
@@ -492,6 +491,9 @@
         <w:t>Алгоритм паузы и вечернюю аудиопрактику «Штиль в теле» мы даем в курсе.</w:t>
         <w:br/>
         <w:t>[👉 Забрать курс и практики за 2 400 ₽]</w:t>
+        <w:br/>
+        <w:br/>
+        <w:t>💬 Напишите мне: сколько обычно длится молчанка в вашей семье после ссор? Читаю все сообщения.</w:t>
       </w:r>
     </w:p>
     <w:p>
@@ -517,6 +519,9 @@
         <w:t>Специальная цена 2 400 ₽ на курс «Мы вместе» скоро закроется:</w:t>
         <w:br/>
         <w:t>[👉 Перезагрузить отношения за 2 400 ₽]</w:t>
+        <w:br/>
+        <w:br/>
+        <w:t>💬 По любым вопросам пишите мне напрямую: @luck_master</w:t>
       </w:r>
     </w:p>
     <w:p>
@@ -543,19 +548,19 @@
           <w:i/>
           <w:sz w:val="20"/>
         </w:rPr>
-        <w:t>• После Урока 0: «Первый выдох сделан! Послушайте вводную практику. В Уроке 1 разберем танец «Нападающий — Убегающий». [👉 Урок 1]»</w:t>
+        <w:t>• После Урока 0: «Первый выдох сделан! Послушайте вводную практику. В Уроке 1 разберем танец ссоры. [👉 Урок 1] (💬 Есть вопрос по браку? Пишите мне в ответ)»</w:t>
         <w:br/>
-        <w:t>• После Урока 1: «Цикл ссор расшифрован! В Уроке 2 осваиваем правило 20 минут и практику «Штиль в теле» для остановки крика. [👉 Урок 2]»</w:t>
+        <w:t>• После Урока 1: «Цикл ссор расшифрован! В Уроке 2 осваиваем правило 20 минут и практику «Штиль в теле». [👉 Урок 2]»</w:t>
         <w:br/>
-        <w:t>• После Урока 2: «Физиология под контролем! В Уроке 3 сбрасываем груз старых обид через гипнотическую сессию «Амнистия». [👉 Урок 3]»</w:t>
+        <w:t>• После Урока 2: «Физиология под контролем! В Уроке 3 сбрасываем груз старых обид через гипноз «Амнистия». [👉 Урок 3]»</w:t>
         <w:br/>
-        <w:t>• После Урока 3: «Обиды отпущены! В Уроке 4 учимся говорить о желаниях по формуле «Мягкого старта» без наездов. [👉 Урок 4]»</w:t>
+        <w:t>• После Урока 3: «Обиды отпущены! В Уроке 4 учимся говорить по формуле «Мягкого старта» без наездов. [👉 Урок 4]»</w:t>
         <w:br/>
-        <w:t>• После Урока 4: «Язык близости освоен! В Уроке 5 возвращаем тактильность, поцелуи, забираем Карту опоры и 4 бонуса! [👉 Урок 5]»</w:t>
+        <w:t>• После Урока 4: «Язык близости освоен! В Уроке 5 возвращаем тактильность, поцелуи и забираем 4 бонуса! [👉 Урок 5]»</w:t>
         <w:br/>
-        <w:t>• После Урока 5: «Поздравляю! Ваш семейный союз перезагружен. Все бонусы остаются в кабинете. [👉 Запись на парную сессию]»</w:t>
+        <w:t>• После Урока 5: «Поздравляю! Ваш союз перезагружен. Напишите мне, как прошел ваш первый 6-секундный поцелуй: [💬 Написать Анатолию]»</w:t>
         <w:br/>
-        <w:t>• Пинг (48 ч): «Здравствуйте! Это Анатолий Фёдоров. 5 минут урока сегодня сохранят тепло в вашем доме на годы: [👉 Продолжить урок]»</w:t>
+        <w:t>• Пинг (48 ч): «Здравствуйте! Это Анатолий. Если возник затык в отношениях — напишите мне в личку. А продолжить урок можно здесь: [👉 Продолжить урок]»</w:t>
       </w:r>
     </w:p>
     <w:p>
@@ -574,27 +579,6 @@
     </w:p>
     <w:p>
       <w:pPr>
-        <w:spacing w:after="80" w:line="276" w:lineRule="auto"/>
-      </w:pPr>
-      <w:r>
-        <w:rPr>
-          <w:rFonts w:ascii="Calibri" w:hAnsi="Calibri"/>
-          <w:b/>
-          <w:sz w:val="20"/>
-        </w:rPr>
-        <w:t xml:space="preserve">Контекст ЦА: </w:t>
-      </w:r>
-      <w:r>
-        <w:rPr>
-          <w:rFonts w:ascii="Calibri" w:hAnsi="Calibri"/>
-          <w:i w:val="0"/>
-          <w:sz w:val="20"/>
-        </w:rPr>
-        <w:t>Люди в состоянии острой душевной травмы, шока, угрозы внезапного распада семьи или ультиматума.</w:t>
-      </w:r>
-    </w:p>
-    <w:p>
-      <w:pPr>
         <w:spacing w:before="160" w:after="40"/>
       </w:pPr>
       <w:r>
@@ -604,7 +588,7 @@
           <w:color w:val="0E6E5D"/>
           <w:sz w:val="23"/>
         </w:rPr>
-        <w:t>ЧАСТЬ 4.1: МЯГКИЙ ПРОГРЕВ К ПОКУПКЕ (3 СООБЩЕНИЯ)</w:t>
+        <w:t>ЧАСТЬ 4.1: МЯГКИЙ ПРОГРЕВ К ПОКУПКЕ (С ОБРАТНОЙ СВЯЗЬЮ)</w:t>
       </w:r>
     </w:p>
     <w:p>
@@ -617,7 +601,7 @@
           <w:i/>
           <w:sz w:val="20"/>
         </w:rPr>
-        <w:t>✉️ СООБЩЕНИЕ 1 (Через 2 часа после теста): «Стоп-кран: почему нельзя принимать решений прямо сейчас»</w:t>
+        <w:t>✉️ СООБЩЕНИЕ 1 (Через 2 часа после теста): «Стоп-кран: почему нельзя принимать решений в шторм»</w:t>
         <w:br/>
         <w:t>Здравствуйте! С вами Анатолий Фёдоров.</w:t>
         <w:br/>
@@ -633,6 +617,11 @@
         <w:t>Этому посвящена экстренная соматическая программа «Точка опоры».</w:t>
         <w:br/>
         <w:t>[👉 Получить доступ к курсу за 2 400 ₽]</w:t>
+        <w:br/>
+        <w:br/>
+        <w:t>💬 Если прямо сейчас вам очень тяжело и не с кем поговорить — нажмите кнопку ниже и напишите мне в личные сообщения. Вы не одни:</w:t>
+        <w:br/>
+        <w:t>[✍️ Написать Анатолию Фёдорову в Telegram]</w:t>
       </w:r>
     </w:p>
     <w:p>
@@ -661,6 +650,9 @@
         <w:t>Готовые формулы защиты достоинства ждут вас в программе курса.</w:t>
         <w:br/>
         <w:t>[👉 Забрать курс за 2 400 ₽]</w:t>
+        <w:br/>
+        <w:br/>
+        <w:t>💬 Если партнер давит на вас или провоцирует на скандал — напишите мне его фразу, я подскажу, как ответить спокойно.</w:t>
       </w:r>
     </w:p>
     <w:p>
@@ -686,6 +678,9 @@
         <w:t>Специальная цена 2 400 ₽ закроется скоро:</w:t>
         <w:br/>
         <w:t>[👉 Начать курс и обрести нерушимую опору]</w:t>
+        <w:br/>
+        <w:br/>
+        <w:t>💬 Личный контакт для экстренных вопросов: @luck_master</w:t>
       </w:r>
     </w:p>
     <w:p>
@@ -712,19 +707,19 @@
           <w:i/>
           <w:sz w:val="20"/>
         </w:rPr>
-        <w:t>• После Урока 0: «Вы нажали стоп-кран! Послушайте 8-мин аудиопрактику заземления перед сном. В Уроке 1 снимем физиологию адреналинового спазма. [👉 Урок 1]»</w:t>
+        <w:t>• После Урока 0: «Вы нажали стоп-кран! Послушайте 8-мин аудиопрактику перед сном. В Уроке 1 снимем адреналиновый спазм. [👉 Урок 1] (💬 Напишите мне, если тело все еще напряжено)»</w:t>
         <w:br/>
         <w:t>• После Урока 1: «Дыхание 4-6-2 под контролем! В Уроке 2 вводим «Правило 14 дней» — как не унизиться и остановить слежку. [👉 Урок 2]»</w:t>
         <w:br/>
-        <w:t>• После Урока 2: «Ваше достоинство защищено! В Уроке 3 выставляем границы перед советчиками и защищаем детей от разборок. [👉 Урок 3]»</w:t>
+        <w:t>• После Урока 2: «Ваше достоинство защищено! В Уроке 3 выставляем границы перед советчиками и защищаем детей. [👉 Урок 3]»</w:t>
         <w:br/>
         <w:t>• После Урока 3: «Границы на замке! В Уроке 4 проводим трезвый аудит: факты против страхов и иллюзий. [👉 Урок 4]»</w:t>
         <w:br/>
-        <w:t>• После Урока 4: «Туман рассеялся! В Уроке 5 выходим на развилку осознанного выбора, забираем главную практику и 4 бонуса! [👉 Урок 5]»</w:t>
+        <w:t>• После Урока 4: «Туман рассеялся! В Уроке 5 выходим на развилку осознанного выбора и забираем 4 бонуса! [👉 Урок 5]»</w:t>
         <w:br/>
-        <w:t>• После Урока 5: «Вы прошли шторм и сохранили себя! Все 4 бонуса остаются в вашем кабинете. [👉 Запись на личную сессию]»</w:t>
+        <w:t>• После Урока 5: «Вы прошли шторм и сохранили себя! Все бонусы ваши навсегда. Напишите мне, какое решение вы приняли: [💬 Написать Анатолию]»</w:t>
         <w:br/>
-        <w:t>• Пинг (48 ч): «Здравствуйте! Это Анатолий Фёдоров. Сделайте 5-минутный шаг к своей ясности сегодня: [👉 Продолжить урок]»</w:t>
+        <w:t>• Пинг (48 ч): «Здравствуйте! Это Анатолий. Если накрыли эмоции и тяжело продолжать — напишите мне в личку. А урок можно продолжить здесь: [👉 Продолжить урок]»</w:t>
       </w:r>
     </w:p>
     <w:sectPr>

</xml_diff>